<commit_message>
JCPA appendix integration into manuscript
</commit_message>
<xml_diff>
--- a/JCPA_tables_FINAL.docx
+++ b/JCPA_tables_FINAL.docx
@@ -2983,7 +2983,7 @@
           </w:tcPr>
           <w:p>
             <w:r>
-              <w:t>-0.013 to -0.001</w:t>
+              <w:t>-0.014 to -0.001</w:t>
             </w:r>
           </w:p>
         </w:tc>
@@ -6290,7 +6290,7 @@
           </w:tcPr>
           <w:p>
             <w:r>
-              <w:t>0.029300435978957</w:t>
+              <w:t>0.0293004359789378</w:t>
             </w:r>
           </w:p>
         </w:tc>
@@ -6300,7 +6300,7 @@
           </w:tcPr>
           <w:p>
             <w:r>
-              <w:t>0.1839369039357427</w:t>
+              <w:t>0.1839369029359153</w:t>
             </w:r>
           </w:p>
         </w:tc>
@@ -6310,7 +6310,7 @@
           </w:tcPr>
           <w:p>
             <w:r>
-              <w:t>-0.0106632246883388</w:t>
+              <w:t>-0.0106632202853943</w:t>
             </w:r>
           </w:p>
         </w:tc>
@@ -6352,7 +6352,7 @@
           </w:tcPr>
           <w:p>
             <w:r>
-              <w:t>0.0097976486916118</w:t>
+              <w:t>0.0097976486915868</w:t>
             </w:r>
           </w:p>
         </w:tc>
@@ -6362,7 +6362,7 @@
           </w:tcPr>
           <w:p>
             <w:r>
-              <w:t>0.0816468772883595</w:t>
+              <w:t>0.0816468760361608</w:t>
             </w:r>
           </w:p>
         </w:tc>
@@ -6372,7 +6372,7 @@
           </w:tcPr>
           <w:p>
             <w:r>
-              <w:t>0.0551197205542313</w:t>
+              <w:t>0.0551197222469218</w:t>
             </w:r>
           </w:p>
         </w:tc>
@@ -6414,7 +6414,7 @@
           </w:tcPr>
           <w:p>
             <w:r>
-              <w:t>0.0884818531209874</w:t>
+              <w:t>0.0884818531208004</w:t>
             </w:r>
           </w:p>
         </w:tc>
@@ -6424,7 +6424,7 @@
           </w:tcPr>
           <w:p>
             <w:r>
-              <w:t>0.2043825464261744</w:t>
+              <w:t>0.2043826907729224</w:t>
             </w:r>
           </w:p>
         </w:tc>
@@ -6434,7 +6434,7 @@
           </w:tcPr>
           <w:p>
             <w:r>
-              <w:t>-0.1279506017217466</w:t>
+              <w:t>-0.1279509738692234</w:t>
             </w:r>
           </w:p>
         </w:tc>
@@ -6476,7 +6476,7 @@
           </w:tcPr>
           <w:p>
             <w:r>
-              <w:t>0.0593407198567986</w:t>
+              <w:t>0.0593407198568021</w:t>
             </w:r>
           </w:p>
         </w:tc>
@@ -6486,7 +6486,7 @@
           </w:tcPr>
           <w:p>
             <w:r>
-              <w:t>0.164491604408235</w:t>
+              <w:t>0.1644916020423305</w:t>
             </w:r>
           </w:p>
         </w:tc>
@@ -6496,7 +6496,7 @@
           </w:tcPr>
           <w:p>
             <w:r>
-              <w:t>-0.1516691457422756</w:t>
+              <w:t>-0.1516691449521056</w:t>
             </w:r>
           </w:p>
         </w:tc>
@@ -6538,7 +6538,7 @@
           </w:tcPr>
           <w:p>
             <w:r>
-              <w:t>0.0444060903046035</w:t>
+              <w:t>0.0444060903046119</w:t>
             </w:r>
           </w:p>
         </w:tc>
@@ -6548,7 +6548,7 @@
           </w:tcPr>
           <w:p>
             <w:r>
-              <w:t>0.1480735301319032</w:t>
+              <w:t>0.148073524583365</w:t>
             </w:r>
           </w:p>
         </w:tc>
@@ -6558,7 +6558,7 @@
           </w:tcPr>
           <w:p>
             <w:r>
-              <w:t>0.0831437221720144</w:t>
+              <w:t>0.0831437141637636</w:t>
             </w:r>
           </w:p>
         </w:tc>
@@ -6600,7 +6600,7 @@
           </w:tcPr>
           <w:p>
             <w:r>
-              <w:t>0.1444174894492097</w:t>
+              <w:t>0.1444174894492124</w:t>
             </w:r>
           </w:p>
         </w:tc>
@@ -6610,7 +6610,7 @@
           </w:tcPr>
           <w:p>
             <w:r>
-              <w:t>0.3036512375095741</w:t>
+              <w:t>0.3036511289006508</w:t>
             </w:r>
           </w:p>
         </w:tc>
@@ -6620,7 +6620,7 @@
           </w:tcPr>
           <w:p>
             <w:r>
-              <w:t>-0.2680256930368754</w:t>
+              <w:t>-0.2680255705173741</w:t>
             </w:r>
           </w:p>
         </w:tc>
@@ -6662,7 +6662,7 @@
           </w:tcPr>
           <w:p>
             <w:r>
-              <w:t>0.0489068465462905</w:t>
+              <w:t>0.0489068465462831</w:t>
             </w:r>
           </w:p>
         </w:tc>
@@ -6672,7 +6672,7 @@
           </w:tcPr>
           <w:p>
             <w:r>
-              <w:t>0.2571351516004428</w:t>
+              <w:t>0.2571351506549926</w:t>
             </w:r>
           </w:p>
         </w:tc>
@@ -6682,7 +6682,7 @@
           </w:tcPr>
           <w:p>
             <w:r>
-              <w:t>-0.1909625167259772</w:t>
+              <w:t>-0.1909625137928648</w:t>
             </w:r>
           </w:p>
         </w:tc>
@@ -6724,7 +6724,7 @@
           </w:tcPr>
           <w:p>
             <w:r>
-              <w:t>0.0043825333785589</w:t>
+              <w:t>0.004382533378559</w:t>
             </w:r>
           </w:p>
         </w:tc>
@@ -6734,7 +6734,7 @@
           </w:tcPr>
           <w:p>
             <w:r>
-              <w:t>0.1800522918063515</w:t>
+              <w:t>0.1800522917924872</w:t>
             </w:r>
           </w:p>
         </w:tc>
@@ -6744,7 +6744,7 @@
           </w:tcPr>
           <w:p>
             <w:r>
-              <w:t>-0.0984116620871223</w:t>
+              <w:t>-0.098411662199711</w:t>
             </w:r>
           </w:p>
         </w:tc>
@@ -6786,7 +6786,7 @@
           </w:tcPr>
           <w:p>
             <w:r>
-              <w:t>0.1826943753700612</w:t>
+              <w:t>0.1826943753700668</w:t>
             </w:r>
           </w:p>
         </w:tc>
@@ -6796,7 +6796,7 @@
           </w:tcPr>
           <w:p>
             <w:r>
-              <w:t>0.2488059137391605</w:t>
+              <w:t>0.2488059139201824</w:t>
             </w:r>
           </w:p>
         </w:tc>
@@ -6806,7 +6806,7 @@
           </w:tcPr>
           <w:p>
             <w:r>
-              <w:t>-0.1367370322694726</w:t>
+              <w:t>-0.1367370317019828</w:t>
             </w:r>
           </w:p>
         </w:tc>
@@ -6848,7 +6848,7 @@
           </w:tcPr>
           <w:p>
             <w:r>
-              <w:t>0.0168998085544814</w:t>
+              <w:t>0.0168998085544957</w:t>
             </w:r>
           </w:p>
         </w:tc>
@@ -6858,7 +6858,7 @@
           </w:tcPr>
           <w:p>
             <w:r>
-              <w:t>0.1182144357751331</w:t>
+              <w:t>0.1182144350993184</w:t>
             </w:r>
           </w:p>
         </w:tc>
@@ -6868,7 +6868,7 @@
           </w:tcPr>
           <w:p>
             <w:r>
-              <w:t>-0.0265778278315405</w:t>
+              <w:t>-0.0265778280351051</w:t>
             </w:r>
           </w:p>
         </w:tc>

</xml_diff>